<commit_message>
fix: corregir los rangos de fecha del CV con guion simple
Un reemplazo global previo habia dejado los ocho rangos de fecha
separados por coma ("November 2025, May 2026"), que no se leen como
rango y rompen el parseo de fechas de empleo en un ATS. Corrige el
docx fuente y regenera el PDF; el resto del documento queda igual.

Co-Authored-By: Claude Opus 5 <noreply@anthropic.com>
</commit_message>
<xml_diff>
--- a/public/docs/joaquin-haro-filippon-salesforce-cv-2026.docx
+++ b/public/docs/joaquin-haro-filippon-salesforce-cv-2026.docx
@@ -222,7 +222,7 @@
           <w:color w:val="6E6E6E"/>
           <w:sz w:val="19"/>
         </w:rPr>
-        <w:t xml:space="preserve">June 2026, August 2026</w:t>
+        <w:t xml:space="preserve">June 2026 - August 2026</w:t>
       </w:r>
     </w:p>
     <w:p>
@@ -291,7 +291,7 @@
           <w:color w:val="6E6E6E"/>
           <w:sz w:val="19"/>
         </w:rPr>
-        <w:t>November 2025, May 2026</w:t>
+        <w:t>November 2025 - May 2026</w:t>
       </w:r>
     </w:p>
     <w:p>
@@ -360,7 +360,7 @@
           <w:color w:val="6E6E6E"/>
           <w:sz w:val="19"/>
         </w:rPr>
-        <w:t>November 2024, April 2025</w:t>
+        <w:t>November 2024 - April 2025</w:t>
       </w:r>
     </w:p>
     <w:p>
@@ -411,7 +411,7 @@
           <w:color w:val="6E6E6E"/>
           <w:sz w:val="19"/>
         </w:rPr>
-        <w:t>2016, present</w:t>
+        <w:t>2016 - present</w:t>
       </w:r>
     </w:p>
     <w:p>
@@ -444,7 +444,7 @@
           <w:color w:val="6E6E6E"/>
           <w:sz w:val="19"/>
         </w:rPr>
-        <w:t>June 2017, August 2021</w:t>
+        <w:t>June 2017 - August 2021</w:t>
       </w:r>
     </w:p>
     <w:p>
@@ -493,7 +493,7 @@
           <w:color w:val="6E6E6E"/>
           <w:sz w:val="19"/>
         </w:rPr>
-        <w:t>April, May 2023</w:t>
+        <w:t>April - May 2023</w:t>
       </w:r>
     </w:p>
     <w:p>
@@ -560,7 +560,7 @@
         <w:spacing w:after="40"/>
       </w:pPr>
       <w:r>
-        <w:t>Salesforce Developer Bootcamp, 800+ hours, Plataforma 5 - CloudGaia (February, May 2023).</w:t>
+        <w:t>Salesforce Developer Bootcamp, 800+ hours, Plataforma 5 - CloudGaia (February - May 2023).</w:t>
       </w:r>
     </w:p>
     <w:p>
@@ -569,7 +569,7 @@
         <w:spacing w:after="40"/>
       </w:pPr>
       <w:r>
-        <w:t>Introductory Salesforce Course, Plataforma 5 - CloudGaia (November 2022, January 2023, 54 hours).</w:t>
+        <w:t>Introductory Salesforce Course, Plataforma 5 - CloudGaia (November 2022 - January 2023, 54 hours).</w:t>
       </w:r>
     </w:p>
     <w:p>

</xml_diff>

<commit_message>
content: inglés C1 (EF SET 90/100) y contexto de CloudAvengers
- Hero (EN y ES): el inglés pasa de B2 a C1 (EF SET 90/100).
- Certificaciones: se suma el EF SET English Certificate, C1 Advanced.
- CloudAvengers: se aclara que fue para un arquitecto y partner de
  Salesforce que operaba en EE.UU., con equipos en India y Latinoamérica
  (bullet de experiencia y contexto del proyecto).
- CV descargable (PDF y DOCX) con los mismos cambios.
- llms.txt: mismo nivel de inglés y la certificación nueva.

Co-Authored-By: Claude Opus 5.5 <noreply@anthropic.com>
</commit_message>
<xml_diff>
--- a/public/docs/joaquin-haro-filippon-salesforce-cv-2026.docx
+++ b/public/docs/joaquin-haro-filippon-salesforce-cv-2026.docx
@@ -369,6 +369,15 @@
         <w:spacing w:after="40"/>
       </w:pPr>
       <w:r>
+        <w:t>Worked for a Salesforce architect and partner operating in the U.S., with teams in India and Latin America.</w:t>
+      </w:r>
+    </w:p>
+    <w:p>
+      <w:pPr>
+        <w:pStyle w:val="ListBullet"/>
+        <w:spacing w:after="40"/>
+      </w:pPr>
+      <w:r>
         <w:t>Built and maintained custom data architecture across a client Salesforce org.</w:t>
       </w:r>
     </w:p>
@@ -603,12 +612,12 @@
         <w:spacing w:after="40"/>
       </w:pPr>
       <w:r>
-        <w:t>English: B2, Upper Intermediate.</w:t>
+        <w:t>English: C1 Advanced. EF SET 90/100 (2026).</w:t>
       </w:r>
     </w:p>
     <w:sectPr>
       <w:pgSz w:w="12240" w:h="15840"/>
-      <w:pgMar w:top="850" w:right="1020" w:bottom="850" w:left="1020" w:header="720" w:footer="720" w:gutter="0"/>
+      <w:pgMar w:top="720" w:right="1020" w:bottom="720" w:left="1020" w:header="720" w:footer="720" w:gutter="0"/>
       <w:cols w:space="720"/>
       <w:docGrid w:linePitch="360"/>
     </w:sectPr>

</xml_diff>

<commit_message>
content: proyectos de Infinitech y bootcamp de Pareto en el CV y el sitio
- Infinitech (EN y ES): se suman los proyectos que llevaba de punta a
  punta (instalaciones informáticas para comercios y PCs a medida) y la
  organización de prioridades y plazos del taller.
- Certificaciones y formación: Pareto Talent Bootcamp (IA, sistemas y
  operaciones), en curso sep - oct 2026. Con 6 tarjetas la grilla queda
  en 3 filas completas.
- CV (PDF y DOCX): los mismos agregados. El interlineado baja de 1,15 a
  1,1 para que siga en 2 páginas. El .docx además queda válido: se
  declaran los namespaces w14/wp14, pBdr va antes de spacing y zoom lleva
  percent (errores que ya traía el original).
- llms.txt: suma el bootcamp.

Co-Authored-By: Claude Opus 5.5 <noreply@anthropic.com>
</commit_message>
<xml_diff>
--- a/public/docs/joaquin-haro-filippon-salesforce-cv-2026.docx
+++ b/public/docs/joaquin-haro-filippon-salesforce-cv-2026.docx
@@ -1,6 +1,6 @@
 
 <file path=word/document.xml><?xml version="1.0" encoding="utf-8"?>
-<w:document xmlns:ns1="http://schemas.openxmlformats.org/markup-compatibility/2006" xmlns:w="http://schemas.openxmlformats.org/wordprocessingml/2006/main" ns1:Ignorable="w14 wp14">
+<w:document xmlns:ns1="http://schemas.openxmlformats.org/markup-compatibility/2006" xmlns:w14="http://schemas.microsoft.com/office/word/2010/wordml" xmlns:wp14="http://schemas.microsoft.com/office/word/2010/wordprocessingDrawing" xmlns:w="http://schemas.openxmlformats.org/wordprocessingml/2006/main" ns1:Ignorable="w14 wp14">
   <w:body>
     <w:p>
       <w:r>
@@ -33,18 +33,18 @@
     </w:p>
     <w:p>
       <w:pPr>
-        <w:spacing w:before="120"/>
         <w:pBdr>
           <w:bottom w:val="single" w:sz="12" w:space="4" w:color="1F4A6E"/>
         </w:pBdr>
+        <w:spacing w:before="120"/>
       </w:pPr>
     </w:p>
     <w:p>
       <w:pPr>
-        <w:spacing w:before="280" w:after="80"/>
         <w:pBdr>
           <w:bottom w:val="single" w:sz="8" w:space="4" w:color="1F4A6E"/>
         </w:pBdr>
+        <w:spacing w:before="280" w:after="80"/>
       </w:pPr>
       <w:r>
         <w:rPr>
@@ -65,10 +65,10 @@
     </w:p>
     <w:p>
       <w:pPr>
-        <w:spacing w:before="280" w:after="80"/>
         <w:pBdr>
           <w:bottom w:val="single" w:sz="8" w:space="4" w:color="1F4A6E"/>
         </w:pBdr>
+        <w:spacing w:before="280" w:after="80"/>
       </w:pPr>
       <w:r>
         <w:rPr>
@@ -108,10 +108,10 @@
     </w:p>
     <w:p>
       <w:pPr>
-        <w:spacing w:before="280" w:after="80"/>
         <w:pBdr>
           <w:bottom w:val="single" w:sz="8" w:space="4" w:color="1F4A6E"/>
         </w:pBdr>
+        <w:spacing w:before="280" w:after="80"/>
       </w:pPr>
       <w:r>
         <w:rPr>
@@ -187,10 +187,10 @@
     </w:p>
     <w:p>
       <w:pPr>
-        <w:spacing w:before="280" w:after="80"/>
         <w:pBdr>
           <w:bottom w:val="single" w:sz="8" w:space="4" w:color="1F4A6E"/>
         </w:pBdr>
+        <w:spacing w:before="280" w:after="80"/>
       </w:pPr>
       <w:r>
         <w:rPr>
@@ -467,10 +467,28 @@
     </w:p>
     <w:p>
       <w:pPr>
-        <w:spacing w:before="280" w:after="80"/>
+        <w:pStyle w:val="ListBullet"/>
+        <w:spacing w:after="40"/>
+      </w:pPr>
+      <w:r>
+        <w:t>Managed my own projects from quote to delivery: IT installations for local businesses and custom PC builds.</w:t>
+      </w:r>
+    </w:p>
+    <w:p>
+      <w:pPr>
+        <w:pStyle w:val="ListBullet"/>
+        <w:spacing w:after="40"/>
+      </w:pPr>
+      <w:r>
+        <w:t>Set priorities and deadlines for the shop's repair work.</w:t>
+      </w:r>
+    </w:p>
+    <w:p>
+      <w:pPr>
         <w:pBdr>
           <w:bottom w:val="single" w:sz="8" w:space="4" w:color="1F4A6E"/>
         </w:pBdr>
+        <w:spacing w:before="280" w:after="80"/>
       </w:pPr>
       <w:r>
         <w:rPr>
@@ -549,10 +567,10 @@
     </w:p>
     <w:p>
       <w:pPr>
-        <w:spacing w:before="280" w:after="80"/>
         <w:pBdr>
           <w:bottom w:val="single" w:sz="8" w:space="4" w:color="1F4A6E"/>
         </w:pBdr>
+        <w:spacing w:before="280" w:after="80"/>
       </w:pPr>
       <w:r>
         <w:rPr>
@@ -561,6 +579,15 @@
           <w:sz w:val="24"/>
         </w:rPr>
         <w:t>EDUCATION</w:t>
+      </w:r>
+    </w:p>
+    <w:p>
+      <w:pPr>
+        <w:pStyle w:val="ListBullet"/>
+        <w:spacing w:after="40"/>
+      </w:pPr>
+      <w:r>
+        <w:t>Pareto Talent Bootcamp: AI, systems and operations for U.S. founders (September - October 2026, in progress).</w:t>
       </w:r>
     </w:p>
     <w:p>
@@ -583,10 +610,10 @@
     </w:p>
     <w:p>
       <w:pPr>
-        <w:spacing w:before="280" w:after="80"/>
         <w:pBdr>
           <w:bottom w:val="single" w:sz="8" w:space="4" w:color="1F4A6E"/>
         </w:pBdr>
+        <w:spacing w:before="280" w:after="80"/>
       </w:pPr>
       <w:r>
         <w:rPr>
@@ -841,7 +868,7 @@
     </w:rPrDefault>
     <w:pPrDefault>
       <w:pPr>
-        <w:spacing w:after="200" w:line="276" w:lineRule="auto"/>
+        <w:spacing w:after="200" w:line="264" w:lineRule="auto"/>
       </w:pPr>
     </w:pPrDefault>
   </w:docDefaults>

</xml_diff>